<commit_message>
Clin Path I Exam 2 L9: follow Ward's revised slides 20, 23, 89, 109
- Slide 20 now gives a resting mean > 20 mmHg: key it, un-hold the
  threshold question, drop the 30-vs-20 conflict callout and cram warning.
- Slide 23 plexiform line removed: plexiform question replaced by a
  left-to-right shunt route question; 4 plexiform distractors, the
  guide sentence, cram text, Arcade card and Pip card text removed.
- Slide 89 tension pneumothorax: "pneumothorax leading to trapped air and
  increased pressure; penetrating or nonpenetrating injury" in guide,
  cram and Pip; trauma caveat dropped.
- Slide 109 reads S. aureus: guide uses it, slip caveat dropped.
- Re-rendered pulmonary sets (membership unchanged), guide splice, cram,
  Arcade, Word copies, Group Study, cram-personal, guide links;
  Pip units u48/u51 rehashed.

Co-Authored-By: Claude Opus 5.5 <noreply@anthropic.com>
</commit_message>
<xml_diff>
--- a/Clinical Pathophysiology I Exam 2/cp-exam-2-cram-sheet.docx
+++ b/Clinical Pathophysiology I Exam 2/cp-exam-2-cram-sheet.docx
@@ -8767,7 +8767,7 @@
                 <w:i w:val="0"/>
                 <w:sz w:val="18"/>
               </w:rPr>
-              <w:t>Pulmonary hypertension ⚠</w:t>
+              <w:t>Pulmonary hypertension</w:t>
             </w:r>
           </w:p>
         </w:tc>
@@ -8790,7 +8790,7 @@
                 <w:i w:val="0"/>
                 <w:sz w:val="18"/>
               </w:rPr>
-              <w:t>Slide: sustained &gt; 30 mmHg. Recording: resting MEAN &gt; 20 mmHg by right heart catheterization. Know both.</w:t>
+              <w:t>Mean pulmonary arterial pressure AT REST &gt; 20 mmHg (normal mean ≈ 15).</w:t>
             </w:r>
           </w:p>
         </w:tc>
@@ -8890,7 +8890,7 @@
                 <w:i w:val="0"/>
                 <w:sz w:val="18"/>
               </w:rPr>
-              <w:t>MEDIA thickens (more muscle), INTIMA fibroses, PLEXIFORM lesions.</w:t>
+              <w:t>MEDIA thickens (more muscle), INTIMA fibroses.</w:t>
             </w:r>
           </w:p>
         </w:tc>
@@ -10422,7 +10422,7 @@
                 <w:i w:val="0"/>
                 <w:sz w:val="18"/>
               </w:rPr>
-              <w:t>Usually trauma (can arise without it); air ENTERS but cannot LEAVE → lung collapses, mediastinum shifts AWAY → less VENOUS RETURN and CARDIAC OUTPUT.</w:t>
+              <w:t>Pneumothorax that TRAPS AIR and builds pressure (penetrating or nonpenetrating injury); air ENTERS but cannot LEAVE → lung collapses, mediastinum shifts AWAY → less VENOUS RETURN and CARDIAC OUTPUT.</w:t>
             </w:r>
           </w:p>
         </w:tc>

</xml_diff>